<commit_message>
Add the live GitHub Pages links and use the published-site screenshots in the Lab 4 report
</commit_message>
<xml_diff>
--- a/reports/Lab4-247050-乔润喆.docx
+++ b/reports/Lab4-247050-乔润喆.docx
@@ -1882,7 +1882,7 @@
           <w:i/>
           <w:sz w:val="18"/>
         </w:rPr>
-        <w:t>图 1  xml-lab/index.html 运行效果：成功读取并显示 book.xml 中的 5 本书</w:t>
+        <w:t>图 1  XML 实验运行效果（线上地址：https://1396832296.github.io/lab4/xml-lab/）：成功读取并显示 book.xml 中的 5 本书</w:t>
       </w:r>
     </w:p>
     <w:p>
@@ -1896,7 +1896,7 @@
           <w:i w:val="0"/>
           <w:sz w:val="20"/>
         </w:rPr>
-        <w:t>GitHub Pages 链接：https://&lt;your-username&gt;.github.io/lab4-xml-json/xml-lab/</w:t>
+        <w:t>GitHub Pages 链接：https://1396832296.github.io/lab4/xml-lab/</w:t>
       </w:r>
     </w:p>
     <w:p>
@@ -4346,7 +4346,7 @@
           <w:i/>
           <w:sz w:val="18"/>
         </w:rPr>
-        <w:t>图 2  json-lab/index.html 运行效果：成功读取并显示 userProfiles.json 中的 4 个用户资料</w:t>
+        <w:t>图 2  JSON 实验运行效果（线上地址：https://1396832296.github.io/lab4/json-lab/）：成功读取并显示 userProfiles.json 中的 4 个用户资料</w:t>
       </w:r>
     </w:p>
     <w:p>
@@ -4360,7 +4360,7 @@
           <w:i w:val="0"/>
           <w:sz w:val="20"/>
         </w:rPr>
-        <w:t>GitHub Pages 链接：https://&lt;your-username&gt;.github.io/lab4-xml-json/json-lab/</w:t>
+        <w:t>GitHub Pages 链接：https://1396832296.github.io/lab4/json-lab/</w:t>
       </w:r>
     </w:p>
     <w:p>

</xml_diff>

<commit_message>
remove build script, tidy readme and report wording
</commit_message>
<xml_diff>
--- a/reports/Lab4-247050-乔润喆.docx
+++ b/reports/Lab4-247050-乔润喆.docx
@@ -1078,23 +1078,7 @@
           <w:i w:val="0"/>
           <w:sz w:val="17"/>
         </w:rPr>
-        <w:t xml:space="preserve">        // Step 3: check that the XML is well-formed.</w:t>
-      </w:r>
-    </w:p>
-    <w:p>
-      <w:pPr>
-        <w:spacing w:before="0" w:after="0" w:line="240" w:lineRule="auto"/>
-        <w:ind w:left="340"/>
-        <w:shd w:val="clear" w:color="auto" w:fill="F5F5F5"/>
-      </w:pPr>
-      <w:r>
-        <w:rPr>
-          <w:rFonts w:ascii="Consolas" w:hAnsi="Consolas" w:eastAsia="Consolas"/>
-          <w:b w:val="0"/>
-          <w:i w:val="0"/>
-          <w:sz w:val="17"/>
-        </w:rPr>
-        <w:t xml:space="preserve">        // DOMParser puts a &lt;parsererror&gt; element in the document when the XML is broken.</w:t>
+        <w:t xml:space="preserve">        // Step 3: check the XML is well-formed (a broken XML gives a &lt;parsererror&gt; element)</w:t>
       </w:r>
     </w:p>
     <w:p>
@@ -1811,7 +1795,7 @@
           <w:i w:val="0"/>
           <w:sz w:val="22"/>
         </w:rPr>
-        <w:t>book.xml 通过在线 XML 校验器检查，结构良好（well-formed），浏览器控制台无 parsererror。</w:t>
+        <w:t>book.xml 用在线 XML 校验器检查过，没有报错，是 well-formed 的。</w:t>
       </w:r>
     </w:p>
     <w:p>
@@ -1827,7 +1811,7 @@
           <w:i w:val="0"/>
           <w:sz w:val="22"/>
         </w:rPr>
-        <w:t>页面加载后提示 “The XML document is well-formed. 5 books found.”，5 本书的 id、title、author、price 全部正确显示。</w:t>
+        <w:t>页面显示 5 本书，id、标题、作者、价格都能正常读到。</w:t>
       </w:r>
     </w:p>
     <w:p>
@@ -1882,7 +1866,7 @@
           <w:i/>
           <w:sz w:val="18"/>
         </w:rPr>
-        <w:t>图 1  XML 实验运行效果（线上地址：https://1396832296.github.io/lab4/xml-lab/）：成功读取并显示 book.xml 中的 5 本书</w:t>
+        <w:t>图 1  XML 实验运行结果：book.xml 中的 5 本书</w:t>
       </w:r>
     </w:p>
     <w:p>
@@ -4275,7 +4259,7 @@
           <w:i w:val="0"/>
           <w:sz w:val="22"/>
         </w:rPr>
-        <w:t>userProfiles.json 通过在线 JSON 校验器检查，JSON 结构良好，无语法错误。</w:t>
+        <w:t>userProfiles.json 用在线 JSON 校验器检查过，格式没有问题。</w:t>
       </w:r>
     </w:p>
     <w:p>
@@ -4291,7 +4275,7 @@
           <w:i w:val="0"/>
           <w:sz w:val="22"/>
         </w:rPr>
-        <w:t>页面加载后提示 “4 user profiles loaded.”，4 位用户的姓名、邮箱、出生日期、地址以及 theme、language、notifications、subscription 全部正确显示。</w:t>
+        <w:t>页面显示 4 个用户，姓名、邮箱、出生日期、地址和 preferences 都正常读到。</w:t>
       </w:r>
     </w:p>
     <w:p>
@@ -4346,7 +4330,7 @@
           <w:i/>
           <w:sz w:val="18"/>
         </w:rPr>
-        <w:t>图 2  JSON 实验运行效果（线上地址：https://1396832296.github.io/lab4/json-lab/）：成功读取并显示 userProfiles.json 中的 4 个用户资料</w:t>
+        <w:t>图 2  JSON 实验运行结果：userProfiles.json 中的 4 个用户资料</w:t>
       </w:r>
     </w:p>
     <w:p>

</xml_diff>